<commit_message>
Devolver el consumo ejecutado al informe y dejar un solo FIAS en la comparecencia
El informe de renovación dejó de decir cuánto se ejecutó de verdad, y ese era el
argumento: de las 13 adendas de 2026, 11 fueron aumentos por consumo
subestimado. Vuelve como dato, no como prosa —una frase en el análisis económico
con {consumoEjecutado} frente a {montoTotal}—, así que no le cuesta tecleo a
nadie: ya se captura en el Momento 1.

Y en el informe de satisfacción el FIAS comparecía dos veces, una como
«representado por» y otra «en su calidad de», herencia del hueco que dejó el
proveedor al salir de la firma. Se queda la primera, que es la que casa con cómo
se nombra al MAE.

Co-Authored-By: Claude Opus 5 <noreply@anthropic.com>
Claude-Session: https://claude.ai/code/session_012AVg1KbcdAceEAoAbYjJ1k
</commit_message>
<xml_diff>
--- a/generador/plantillas/10_Informe_satisfaccion.docx
+++ b/generador/plantillas/10_Informe_satisfaccion.docx
@@ -361,7 +361,7 @@
           <w:sz w:val="20"/>
           <w:szCs w:val="20"/>
         </w:rPr>
-        <w:t xml:space="preserve"> del área protegida por parte del MAE; y,</w:t>
+        <w:t xml:space="preserve"> del área protegida por parte del MAE, con el objeto de suscribir</w:t>
       </w:r>
       <w:r>
         <w:rPr>
@@ -370,7 +370,7 @@
           <w:szCs w:val="20"/>
           <w:lang w:val="es-ES"/>
         </w:rPr>
-        <w:t xml:space="preserve"> por otra, </w:t>
+        <w:t xml:space="preserve"/>
       </w:r>
       <w:r>
         <w:rPr>
@@ -380,15 +380,15 @@
           <w:sz w:val="20"/>
           <w:szCs w:val="20"/>
         </w:rPr>
-        <w:t xml:space="preserve">{ac} </w:t>
-      </w:r>
-      <w:r>
-        <w:rPr>
-          <w:rFonts w:ascii="Titillium Web" w:hAnsi="Titillium Web"/>
-          <w:sz w:val="20"/>
-          <w:szCs w:val="20"/>
-        </w:rPr>
-        <w:t xml:space="preserve">en su calidad de {administradoracontadora} FAP-FIAS {dellaAP} {area},</w:t>
+        <w:t xml:space="preserve"/>
+      </w:r>
+      <w:r>
+        <w:rPr>
+          <w:rFonts w:ascii="Titillium Web" w:hAnsi="Titillium Web"/>
+          <w:sz w:val="20"/>
+          <w:szCs w:val="20"/>
+        </w:rPr>
+        <w:t xml:space="preserve"/>
       </w:r>
       <w:proofErr w:type="spellStart"/>
       <w:r>
@@ -465,15 +465,15 @@
           <w:szCs w:val="20"/>
           <w:lang w:val="es-ES"/>
         </w:rPr>
+        <w:t xml:space="preserve"/>
+      </w:r>
+      <w:r>
+        <w:rPr>
+          <w:rFonts w:ascii="Titillium Web" w:hAnsi="Titillium Web"/>
+          <w:sz w:val="20"/>
+          <w:szCs w:val="20"/>
+        </w:rPr>
         <w:t xml:space="preserve"> </w:t>
-      </w:r>
-      <w:r>
-        <w:rPr>
-          <w:rFonts w:ascii="Titillium Web" w:hAnsi="Titillium Web"/>
-          <w:sz w:val="20"/>
-          <w:szCs w:val="20"/>
-        </w:rPr>
-        <w:t xml:space="preserve">con el objeto de suscribir </w:t>
       </w:r>
       <w:r>
         <w:rPr>

</xml_diff>

<commit_message>
Devolver el consumo ejecutado al informe y dejar un solo FIAS en la comparecencia (#23)
El informe de renovación dejó de decir cuánto se ejecutó de verdad, y ese era el
argumento: de las 13 adendas de 2026, 11 fueron aumentos por consumo
subestimado. Vuelve como dato, no como prosa —una frase en el análisis económico
con {consumoEjecutado} frente a {montoTotal}—, así que no le cuesta tecleo a
nadie: ya se captura en el Momento 1.

Y en el informe de satisfacción el FIAS comparecía dos veces, una como
«representado por» y otra «en su calidad de», herencia del hueco que dejó el
proveedor al salir de la firma. Se queda la primera, que es la que casa con cómo
se nombra al MAE.


Claude-Session: https://claude.ai/code/session_012AVg1KbcdAceEAoAbYjJ1k

Co-authored-by: Claude <noreply@anthropic.com>
</commit_message>
<xml_diff>
--- a/generador/plantillas/10_Informe_satisfaccion.docx
+++ b/generador/plantillas/10_Informe_satisfaccion.docx
@@ -361,7 +361,7 @@
           <w:sz w:val="20"/>
           <w:szCs w:val="20"/>
         </w:rPr>
-        <w:t xml:space="preserve"> del área protegida por parte del MAE; y,</w:t>
+        <w:t xml:space="preserve"> del área protegida por parte del MAE, con el objeto de suscribir</w:t>
       </w:r>
       <w:r>
         <w:rPr>
@@ -370,7 +370,7 @@
           <w:szCs w:val="20"/>
           <w:lang w:val="es-ES"/>
         </w:rPr>
-        <w:t xml:space="preserve"> por otra, </w:t>
+        <w:t xml:space="preserve"/>
       </w:r>
       <w:r>
         <w:rPr>
@@ -380,15 +380,15 @@
           <w:sz w:val="20"/>
           <w:szCs w:val="20"/>
         </w:rPr>
-        <w:t xml:space="preserve">{ac} </w:t>
-      </w:r>
-      <w:r>
-        <w:rPr>
-          <w:rFonts w:ascii="Titillium Web" w:hAnsi="Titillium Web"/>
-          <w:sz w:val="20"/>
-          <w:szCs w:val="20"/>
-        </w:rPr>
-        <w:t xml:space="preserve">en su calidad de {administradoracontadora} FAP-FIAS {dellaAP} {area},</w:t>
+        <w:t xml:space="preserve"/>
+      </w:r>
+      <w:r>
+        <w:rPr>
+          <w:rFonts w:ascii="Titillium Web" w:hAnsi="Titillium Web"/>
+          <w:sz w:val="20"/>
+          <w:szCs w:val="20"/>
+        </w:rPr>
+        <w:t xml:space="preserve"/>
       </w:r>
       <w:proofErr w:type="spellStart"/>
       <w:r>
@@ -465,15 +465,15 @@
           <w:szCs w:val="20"/>
           <w:lang w:val="es-ES"/>
         </w:rPr>
+        <w:t xml:space="preserve"/>
+      </w:r>
+      <w:r>
+        <w:rPr>
+          <w:rFonts w:ascii="Titillium Web" w:hAnsi="Titillium Web"/>
+          <w:sz w:val="20"/>
+          <w:szCs w:val="20"/>
+        </w:rPr>
         <w:t xml:space="preserve"> </w:t>
-      </w:r>
-      <w:r>
-        <w:rPr>
-          <w:rFonts w:ascii="Titillium Web" w:hAnsi="Titillium Web"/>
-          <w:sz w:val="20"/>
-          <w:szCs w:val="20"/>
-        </w:rPr>
-        <w:t xml:space="preserve">con el objeto de suscribir </w:t>
       </w:r>
       <w:r>
         <w:rPr>

</xml_diff>